<commit_message>
[Human] update docs and prepare for design
</commit_message>
<xml_diff>
--- a/ai/agent-log.md/架构助手.docx
+++ b/ai/agent-log.md/架构助手.docx
@@ -42,11 +42,6 @@
       </w:r>
     </w:p>
     <w:p>
-      <w:pPr>
-        <w:rPr>
-          <w:rFonts w:hint="eastAsia"/>
-        </w:rPr>
-      </w:pPr>
       <w:r>
         <w:rPr>
           <w:rFonts w:hint="eastAsia"/>
@@ -55,6 +50,77 @@
       </w:r>
       <w:r>
         <w:t>dea7f84</w:t>
+      </w:r>
+    </w:p>
+    <w:p>
+      <w:pPr>
+        <w:rPr>
+          <w:rFonts w:hint="eastAsia"/>
+        </w:rPr>
+      </w:pPr>
+      <w:r>
+        <w:rPr>
+          <w:rFonts w:hint="eastAsia"/>
+        </w:rPr>
+        <w:t>主要帮助：</w:t>
+      </w:r>
+    </w:p>
+    <w:p>
+      <w:pPr>
+        <w:rPr>
+          <w:rFonts w:hint="eastAsia"/>
+        </w:rPr>
+      </w:pPr>
+      <w:r>
+        <w:rPr>
+          <w:rFonts w:hint="eastAsia"/>
+        </w:rPr>
+        <w:t>设计项目三层分包架构，划分model（实体）、service（业务逻辑）、util（工具类）三个包，写明每个包下需要创建的类和各自职责，只出架构方案，不编写代码。</w:t>
+      </w:r>
+    </w:p>
+    <w:p>
+      <w:pPr>
+        <w:rPr>
+          <w:rFonts w:hint="eastAsia"/>
+        </w:rPr>
+      </w:pPr>
+      <w:r>
+        <w:rPr>
+          <w:rFonts w:hint="eastAsia"/>
+        </w:rPr>
+        <w:t>本人决定：</w:t>
+      </w:r>
+    </w:p>
+    <w:p>
+      <w:pPr>
+        <w:rPr>
+          <w:rFonts w:hint="eastAsia"/>
+        </w:rPr>
+      </w:pPr>
+      <w:r>
+        <w:rPr>
+          <w:rFonts w:hint="eastAsia"/>
+        </w:rPr>
+        <w:t>采纳分层分包设计，在项目src下手动新建service、util两个程序包，没有直接复制AI生成代码。</w:t>
+      </w:r>
+    </w:p>
+    <w:p>
+      <w:pPr>
+        <w:rPr>
+          <w:rFonts w:hint="eastAsia"/>
+        </w:rPr>
+      </w:pPr>
+      <w:r>
+        <w:rPr>
+          <w:rFonts w:hint="eastAsia"/>
+        </w:rPr>
+        <w:t>对应提交编号：</w:t>
+      </w:r>
+      <w:r>
+        <w:rPr>
+          <w:rFonts w:hint="eastAsia"/>
+        </w:rPr>
+        <w:t>b07bea6</w:t>
       </w:r>
     </w:p>
     <w:sectPr>
@@ -728,6 +794,7 @@
   <w:style w:type="character" w:default="1" w:styleId="a0">
     <w:name w:val="Default Paragraph Font"/>
     <w:uiPriority w:val="1"/>
+    <w:semiHidden/>
     <w:unhideWhenUsed/>
   </w:style>
   <w:style w:type="table" w:default="1" w:styleId="a1">

</xml_diff>